<commit_message>
Diagramas de flujo y Entidad-Relacion
</commit_message>
<xml_diff>
--- a/Diagramas_MusicPro.docx
+++ b/Diagramas_MusicPro.docx
@@ -9,14 +9,11 @@
     </w:p>
     <w:p>
       <w:r>
-        <w:rPr>
-          <w:noProof/>
-        </w:rPr>
         <w:drawing>
-          <wp:inline distT="0" distB="0" distL="0" distR="0" wp14:anchorId="19F24765" wp14:editId="120F08CF">
-            <wp:extent cx="5612130" cy="2073275"/>
-            <wp:effectExtent l="0" t="0" r="7620" b="3175"/>
-            <wp:docPr id="813480554" name="Imagen 1"/>
+          <wp:inline distT="0" distB="0" distL="0" distR="0" wp14:anchorId="231EB931" wp14:editId="5912E871">
+            <wp:extent cx="5612130" cy="2686050"/>
+            <wp:effectExtent l="0" t="0" r="7620" b="0"/>
+            <wp:docPr id="638033837" name="Imagen 1"/>
             <wp:cNvGraphicFramePr>
               <a:graphicFrameLocks xmlns:a="http://schemas.openxmlformats.org/drawingml/2006/main" noChangeAspect="1"/>
             </wp:cNvGraphicFramePr>
@@ -24,7 +21,7 @@
               <a:graphicData uri="http://schemas.openxmlformats.org/drawingml/2006/picture">
                 <pic:pic xmlns:pic="http://schemas.openxmlformats.org/drawingml/2006/picture">
                   <pic:nvPicPr>
-                    <pic:cNvPr id="813480554" name=""/>
+                    <pic:cNvPr id="638033837" name=""/>
                     <pic:cNvPicPr/>
                   </pic:nvPicPr>
                   <pic:blipFill>
@@ -36,7 +33,7 @@
                   <pic:spPr>
                     <a:xfrm>
                       <a:off x="0" y="0"/>
-                      <a:ext cx="5612130" cy="2073275"/>
+                      <a:ext cx="5612130" cy="2686050"/>
                     </a:xfrm>
                     <a:prstGeom prst="rect">
                       <a:avLst/>
@@ -56,14 +53,11 @@
     </w:p>
     <w:p>
       <w:r>
-        <w:rPr>
-          <w:noProof/>
-        </w:rPr>
         <w:drawing>
-          <wp:inline distT="0" distB="0" distL="0" distR="0" wp14:anchorId="01E3F39A" wp14:editId="77F37558">
-            <wp:extent cx="5612130" cy="1670685"/>
-            <wp:effectExtent l="0" t="0" r="7620" b="5715"/>
-            <wp:docPr id="940819243" name="Imagen 1"/>
+          <wp:inline distT="0" distB="0" distL="0" distR="0" wp14:anchorId="7B887833" wp14:editId="1677A9E6">
+            <wp:extent cx="5612130" cy="1682750"/>
+            <wp:effectExtent l="0" t="0" r="7620" b="0"/>
+            <wp:docPr id="1975225257" name="Imagen 1"/>
             <wp:cNvGraphicFramePr>
               <a:graphicFrameLocks xmlns:a="http://schemas.openxmlformats.org/drawingml/2006/main" noChangeAspect="1"/>
             </wp:cNvGraphicFramePr>
@@ -71,7 +65,7 @@
               <a:graphicData uri="http://schemas.openxmlformats.org/drawingml/2006/picture">
                 <pic:pic xmlns:pic="http://schemas.openxmlformats.org/drawingml/2006/picture">
                   <pic:nvPicPr>
-                    <pic:cNvPr id="940819243" name=""/>
+                    <pic:cNvPr id="1975225257" name=""/>
                     <pic:cNvPicPr/>
                   </pic:nvPicPr>
                   <pic:blipFill>
@@ -83,7 +77,7 @@
                   <pic:spPr>
                     <a:xfrm>
                       <a:off x="0" y="0"/>
-                      <a:ext cx="5612130" cy="1670685"/>
+                      <a:ext cx="5612130" cy="1682750"/>
                     </a:xfrm>
                     <a:prstGeom prst="rect">
                       <a:avLst/>
@@ -97,7 +91,11 @@
       </w:r>
     </w:p>
     <w:p/>
-    <w:p/>
+    <w:p>
+      <w:r>
+        <w:t>https://github.com/Darknmlech/musicpro-bodega</w:t>
+      </w:r>
+    </w:p>
     <w:p/>
     <w:p/>
     <w:p/>

</xml_diff>